<commit_message>
Count the résumé's experience as 8+ years on every surface
Fullstack began Jun 2018, so 7+ had gone stale. The site, canonical
docx, bullet bank, and the drift check move together, and the published
assets are rebuilt. Two straight apostrophes in canonical are curled.

Co-Authored-By: Claude Opus 5.5 <noreply@anthropic.com>
</commit_message>
<xml_diff>
--- a/public/resume/malcolm-xavier-bullet-bank-template.docx
+++ b/public/resume/malcolm-xavier-bullet-bank-template.docx
@@ -40,7 +40,7 @@
       <w:pPr>
         <w:spacing w:after="240" w:before="0"/>
       </w:pPr>
-      <w:hyperlink w:history="1" r:id="rIdsil_ex9ckxxzlstahccxp">
+      <w:hyperlink w:history="1" r:id="rIdhfmoqbwdxtdqad1ysaav5">
         <w:r>
           <w:rPr>
             <w:rFonts w:ascii="DM Sans" w:cs="DM Sans" w:eastAsia="DM Sans" w:hAnsi="DM Sans"/>
@@ -69,7 +69,7 @@
         </w:rPr>
         <w:t xml:space="preserve"> · </w:t>
       </w:r>
-      <w:hyperlink w:history="1" r:id="rId8key53zjiwduyijp6roan">
+      <w:hyperlink w:history="1" r:id="rIda3ml56jd1w462kuczic6v">
         <w:r>
           <w:rPr>
             <w:rFonts w:ascii="DM Sans" w:cs="DM Sans" w:eastAsia="DM Sans" w:hAnsi="DM Sans"/>
@@ -98,7 +98,7 @@
         </w:rPr>
         <w:t xml:space="preserve"> · </w:t>
       </w:r>
-      <w:hyperlink w:history="1" r:id="rIdfejo8pvgyzkd4q3cynvvv">
+      <w:hyperlink w:history="1" r:id="rId2yg2d-ubkbhbblphacfny">
         <w:r>
           <w:rPr>
             <w:rFonts w:ascii="DM Sans" w:cs="DM Sans" w:eastAsia="DM Sans" w:hAnsi="DM Sans"/>
@@ -156,7 +156,7 @@
           <w:sz w:val="21"/>
           <w:szCs w:val="21"/>
         </w:rPr>
-        <w:t xml:space="preserve">Senior Product Manager with 7+ years scaling growth, marketing, and data platforms in media, publishing, and B2B SaaS. Built and operated MarTech infrastructure for 22M+ users across 40+ brands, driving 33% YoY email revenue growth. Applied an MS in Law (focused on data privacy and IP) to data governance and compliance-related roadmap tradeoffs. Architects AI-native discovery and delivery loops, with three years of hands-on LLM and agent training and evaluation.</w:t>
+        <w:t xml:space="preserve">Senior Product Manager with 8+ years scaling growth, marketing, and data platforms in media, publishing, and B2B SaaS. Built and operated MarTech infrastructure for 22M+ users across 40+ brands, driving 33% YoY email revenue growth. Applied an MS in Law (focused on data privacy and IP) to data governance and compliance-related roadmap tradeoffs. Architects AI-native discovery and delivery loops, with three years of hands-on LLM and agent training and evaluation.</w:t>
       </w:r>
     </w:p>
     <w:p>
@@ -268,7 +268,7 @@
         </w:rPr>
         <w:t xml:space="preserve">Build and operate the </w:t>
       </w:r>
-      <w:hyperlink w:history="1" r:id="rIdrdscduj9s0thgq_4th75q">
+      <w:hyperlink w:history="1" r:id="rIdqirbpht8qvpjdzqqhajmi">
         <w:r>
           <w:rPr>
             <w:rFonts w:ascii="DM Sans" w:cs="DM Sans" w:eastAsia="DM Sans" w:hAnsi="DM Sans"/>
@@ -334,7 +334,7 @@
         <w:spacing w:after="40" w:before="0"/>
         <w:ind w:left="288"/>
       </w:pPr>
-      <w:hyperlink w:history="1" r:id="rIdi5zqbdw72n535ffu_74u3">
+      <w:hyperlink w:history="1" r:id="rIdh4gdldhpeuqjxpnzz5xww">
         <w:r>
           <w:rPr>
             <w:rFonts w:ascii="DM Sans" w:cs="DM Sans" w:eastAsia="DM Sans" w:hAnsi="DM Sans"/>
@@ -375,7 +375,7 @@
         <w:spacing w:after="40" w:before="0"/>
         <w:ind w:left="288"/>
       </w:pPr>
-      <w:hyperlink w:history="1" r:id="rId5jw4jt1qi9rkorpm0pfc4">
+      <w:hyperlink w:history="1" r:id="rIdguqjk4xskltnoapomxpwr">
         <w:r>
           <w:rPr>
             <w:rFonts w:ascii="DM Sans" w:cs="DM Sans" w:eastAsia="DM Sans" w:hAnsi="DM Sans"/>
@@ -416,7 +416,7 @@
         <w:spacing w:after="40" w:before="0"/>
         <w:ind w:left="288"/>
       </w:pPr>
-      <w:hyperlink w:history="1" r:id="rIdymbggoqenjewxo2higtkz">
+      <w:hyperlink w:history="1" r:id="rIdt3awv7b4gqgnbegiukzj9">
         <w:r>
           <w:rPr>
             <w:rFonts w:ascii="DM Sans" w:cs="DM Sans" w:eastAsia="DM Sans" w:hAnsi="DM Sans"/>
@@ -520,7 +520,7 @@
         </w:rPr>
         <w:t xml:space="preserve">Created content marketing strategy for </w:t>
       </w:r>
-      <w:hyperlink w:history="1" r:id="rId8cgsr1vcxt192tk__yi8g">
+      <w:hyperlink w:history="1" r:id="rIdeuwlrvn-aybdhfmyuiqcc">
         <w:r>
           <w:rPr>
             <w:rFonts w:ascii="DM Sans" w:cs="DM Sans" w:eastAsia="DM Sans" w:hAnsi="DM Sans"/>
@@ -611,7 +611,7 @@
         <w:spacing w:after="40" w:before="0"/>
         <w:ind w:left="288"/>
       </w:pPr>
-      <w:hyperlink w:history="1" r:id="rIdei2z0uvkxxcdxdl7v1s9g">
+      <w:hyperlink w:history="1" r:id="rIdj3zviizmtqspz6yg8vzo7">
         <w:r>
           <w:rPr>
             <w:rFonts w:ascii="DM Sans" w:cs="DM Sans" w:eastAsia="DM Sans" w:hAnsi="DM Sans"/>
@@ -745,7 +745,7 @@
         <w:keepNext/>
         <w:spacing w:after="0" w:before="200"/>
       </w:pPr>
-      <w:hyperlink w:history="1" r:id="rIdp18kfdh7vedenddwuymbc">
+      <w:hyperlink w:history="1" r:id="rIdk_gfrrg-_k3ffjh4xf3hx">
         <w:r>
           <w:rPr>
             <w:rFonts w:ascii="DM Sans" w:cs="DM Sans" w:eastAsia="DM Sans" w:hAnsi="DM Sans"/>
@@ -1364,7 +1364,7 @@
         <w:keepNext/>
         <w:spacing w:after="0" w:before="200"/>
       </w:pPr>
-      <w:hyperlink w:history="1" r:id="rIdgzvnp2funrqofdcbtbkn4">
+      <w:hyperlink w:history="1" r:id="rIdldhcnhkls6gvthkaa-w8i">
         <w:r>
           <w:rPr>
             <w:rFonts w:ascii="DM Sans" w:cs="DM Sans" w:eastAsia="DM Sans" w:hAnsi="DM Sans"/>
@@ -1894,7 +1894,7 @@
         <w:keepNext/>
         <w:spacing w:after="0" w:before="200"/>
       </w:pPr>
-      <w:hyperlink w:history="1" r:id="rIdxydwg7s1vsseonsjfld3r">
+      <w:hyperlink w:history="1" r:id="rId4skpjimhpg32wfz60qg4t">
         <w:r>
           <w:rPr>
             <w:rFonts w:ascii="DM Sans" w:cs="DM Sans" w:eastAsia="DM Sans" w:hAnsi="DM Sans"/>
@@ -2211,7 +2211,7 @@
         <w:keepNext/>
         <w:spacing w:after="0" w:before="200"/>
       </w:pPr>
-      <w:hyperlink w:history="1" r:id="rIdqiyqlgkqpb0ht6kkliv-x">
+      <w:hyperlink w:history="1" r:id="rIdhjacixp_9hx4mfsa6_bo-">
         <w:r>
           <w:rPr>
             <w:rFonts w:ascii="DM Sans" w:cs="DM Sans" w:eastAsia="DM Sans" w:hAnsi="DM Sans"/>
@@ -2478,7 +2478,7 @@
         <w:keepNext/>
         <w:spacing w:after="0" w:before="200"/>
       </w:pPr>
-      <w:hyperlink w:history="1" r:id="rIdy3k4rzeicyfm58itpa_qn">
+      <w:hyperlink w:history="1" r:id="rIdyhjqkbdtcskjxwljzk7wo">
         <w:r>
           <w:rPr>
             <w:rFonts w:ascii="DM Sans" w:cs="DM Sans" w:eastAsia="DM Sans" w:hAnsi="DM Sans"/>
@@ -2915,7 +2915,7 @@
         <w:keepNext/>
         <w:spacing w:after="0" w:before="0"/>
       </w:pPr>
-      <w:hyperlink w:history="1" r:id="rId3vvf_mxclrxbl5-hp5jvk">
+      <w:hyperlink w:history="1" r:id="rIdb_w-mavqszgu0yq7mwkly">
         <w:r>
           <w:rPr>
             <w:rFonts w:ascii="DM Sans" w:cs="DM Sans" w:eastAsia="DM Sans" w:hAnsi="DM Sans"/>
@@ -3069,7 +3069,7 @@
         <w:keepNext/>
         <w:spacing w:after="0" w:before="200"/>
       </w:pPr>
-      <w:hyperlink w:history="1" r:id="rIdo3hkzjotrks-todvuk5qz">
+      <w:hyperlink w:history="1" r:id="rIdhlzo6zch_nhnepbz5a5qe">
         <w:r>
           <w:rPr>
             <w:rFonts w:ascii="DM Sans" w:cs="DM Sans" w:eastAsia="DM Sans" w:hAnsi="DM Sans"/>
@@ -3198,7 +3198,7 @@
         <w:keepNext/>
         <w:spacing w:after="0" w:before="200"/>
       </w:pPr>
-      <w:hyperlink w:history="1" r:id="rIdlyrj8mi0pbm9msgr3abdo">
+      <w:hyperlink w:history="1" r:id="rIdjcl_a9klq-7eawz5bg5h2">
         <w:r>
           <w:rPr>
             <w:rFonts w:ascii="DM Sans" w:cs="DM Sans" w:eastAsia="DM Sans" w:hAnsi="DM Sans"/>
@@ -3419,7 +3419,7 @@
       </w:pBdr>
       <w:spacing w:after="80" w:before="40"/>
     </w:pPr>
-    <w:hyperlink w:history="1" r:id="rIdjg55dtqcwnxu9trlr-lx2">
+    <w:hyperlink w:history="1" r:id="rIdj96lm5__yv6n9xpidyuuu">
       <w:r>
         <w:rPr>
           <w:rFonts w:ascii="DM Sans" w:cs="DM Sans" w:eastAsia="DM Sans" w:hAnsi="DM Sans"/>
@@ -3444,7 +3444,7 @@
       </w:rPr>
       <w:t xml:space="preserve"> · </w:t>
     </w:r>
-    <w:hyperlink w:history="1" r:id="rIdkumvvzxkno7endevo9w8s">
+    <w:hyperlink w:history="1" r:id="rId499ynes2mhvlf616nrrfd">
       <w:r>
         <w:rPr>
           <w:rFonts w:ascii="DM Sans" w:cs="DM Sans" w:eastAsia="DM Sans" w:hAnsi="DM Sans"/>
@@ -3469,7 +3469,7 @@
       </w:rPr>
       <w:t xml:space="preserve"> · </w:t>
     </w:r>
-    <w:hyperlink w:history="1" r:id="rIdsfkfcmar6bx7stqxseo_9">
+    <w:hyperlink w:history="1" r:id="rIdabcbrjrqoq2phoucybtyu">
       <w:r>
         <w:rPr>
           <w:rFonts w:ascii="DM Sans" w:cs="DM Sans" w:eastAsia="DM Sans" w:hAnsi="DM Sans"/>

</xml_diff>

<commit_message>
Add the consent, preference-center, and integration work to the bullet bank
Five lines from his own account of what he owned: the privacy policy
operationalized in newsletter signup, the consent data model and
subscription-record deletion in the CDP, the preference center, and at
Muck Rack the partner integrations and contract-to-spec work. Regenerates
the published bank, which also picks up the gap-assessment wording from
76fb144.

Co-Authored-By: Claude Opus 5.5 <noreply@anthropic.com>
</commit_message>
<xml_diff>
--- a/public/resume/malcolm-xavier-bullet-bank-template.docx
+++ b/public/resume/malcolm-xavier-bullet-bank-template.docx
@@ -40,7 +40,7 @@
       <w:pPr>
         <w:spacing w:after="240" w:before="0"/>
       </w:pPr>
-      <w:hyperlink w:history="1" r:id="rIdhfmoqbwdxtdqad1ysaav5">
+      <w:hyperlink w:history="1" r:id="rId738dqap1hymbecf58fp9x">
         <w:r>
           <w:rPr>
             <w:rFonts w:ascii="DM Sans" w:cs="DM Sans" w:eastAsia="DM Sans" w:hAnsi="DM Sans"/>
@@ -69,7 +69,7 @@
         </w:rPr>
         <w:t xml:space="preserve"> · </w:t>
       </w:r>
-      <w:hyperlink w:history="1" r:id="rIda3ml56jd1w462kuczic6v">
+      <w:hyperlink w:history="1" r:id="rId_21tc3qi2smykghtwnwf4">
         <w:r>
           <w:rPr>
             <w:rFonts w:ascii="DM Sans" w:cs="DM Sans" w:eastAsia="DM Sans" w:hAnsi="DM Sans"/>
@@ -98,7 +98,7 @@
         </w:rPr>
         <w:t xml:space="preserve"> · </w:t>
       </w:r>
-      <w:hyperlink w:history="1" r:id="rId2yg2d-ubkbhbblphacfny">
+      <w:hyperlink w:history="1" r:id="rIdrlsozcqw_rwypjwaaojub">
         <w:r>
           <w:rPr>
             <w:rFonts w:ascii="DM Sans" w:cs="DM Sans" w:eastAsia="DM Sans" w:hAnsi="DM Sans"/>
@@ -268,7 +268,7 @@
         </w:rPr>
         <w:t xml:space="preserve">Build and operate the </w:t>
       </w:r>
-      <w:hyperlink w:history="1" r:id="rIdqirbpht8qvpjdzqqhajmi">
+      <w:hyperlink w:history="1" r:id="rIdphkhwwwo0kikptbq7d2wk">
         <w:r>
           <w:rPr>
             <w:rFonts w:ascii="DM Sans" w:cs="DM Sans" w:eastAsia="DM Sans" w:hAnsi="DM Sans"/>
@@ -334,7 +334,7 @@
         <w:spacing w:after="40" w:before="0"/>
         <w:ind w:left="288"/>
       </w:pPr>
-      <w:hyperlink w:history="1" r:id="rIdh4gdldhpeuqjxpnzz5xww">
+      <w:hyperlink w:history="1" r:id="rIdp2tvupepd_sqhf7hgvoeh">
         <w:r>
           <w:rPr>
             <w:rFonts w:ascii="DM Sans" w:cs="DM Sans" w:eastAsia="DM Sans" w:hAnsi="DM Sans"/>
@@ -375,7 +375,7 @@
         <w:spacing w:after="40" w:before="0"/>
         <w:ind w:left="288"/>
       </w:pPr>
-      <w:hyperlink w:history="1" r:id="rIdguqjk4xskltnoapomxpwr">
+      <w:hyperlink w:history="1" r:id="rId13wifbvcrxd25rbobgowx">
         <w:r>
           <w:rPr>
             <w:rFonts w:ascii="DM Sans" w:cs="DM Sans" w:eastAsia="DM Sans" w:hAnsi="DM Sans"/>
@@ -416,7 +416,7 @@
         <w:spacing w:after="40" w:before="0"/>
         <w:ind w:left="288"/>
       </w:pPr>
-      <w:hyperlink w:history="1" r:id="rIdt3awv7b4gqgnbegiukzj9">
+      <w:hyperlink w:history="1" r:id="rIdw3lhyobysxwcxvys0tis6">
         <w:r>
           <w:rPr>
             <w:rFonts w:ascii="DM Sans" w:cs="DM Sans" w:eastAsia="DM Sans" w:hAnsi="DM Sans"/>
@@ -520,7 +520,7 @@
         </w:rPr>
         <w:t xml:space="preserve">Created content marketing strategy for </w:t>
       </w:r>
-      <w:hyperlink w:history="1" r:id="rIdeuwlrvn-aybdhfmyuiqcc">
+      <w:hyperlink w:history="1" r:id="rIdcwh3ovapkyswengsbfvok">
         <w:r>
           <w:rPr>
             <w:rFonts w:ascii="DM Sans" w:cs="DM Sans" w:eastAsia="DM Sans" w:hAnsi="DM Sans"/>
@@ -611,7 +611,7 @@
         <w:spacing w:after="40" w:before="0"/>
         <w:ind w:left="288"/>
       </w:pPr>
-      <w:hyperlink w:history="1" r:id="rIdj3zviizmtqspz6yg8vzo7">
+      <w:hyperlink w:history="1" r:id="rIdxksvqzu2afhdxasul0uey">
         <w:r>
           <w:rPr>
             <w:rFonts w:ascii="DM Sans" w:cs="DM Sans" w:eastAsia="DM Sans" w:hAnsi="DM Sans"/>
@@ -737,7 +737,7 @@
           <w:sz w:val="21"/>
           <w:szCs w:val="21"/>
         </w:rPr>
-        <w:t xml:space="preserve">Initiated organization-wide investigation to achieve GDPR and CCPA compliance</w:t>
+        <w:t xml:space="preserve">Led organization-wide GDPR and CCPA compliance gap assessment</w:t>
       </w:r>
     </w:p>
     <w:p>
@@ -745,7 +745,7 @@
         <w:keepNext/>
         <w:spacing w:after="0" w:before="200"/>
       </w:pPr>
-      <w:hyperlink w:history="1" r:id="rIdk_gfrrg-_k3ffjh4xf3hx">
+      <w:hyperlink w:history="1" r:id="rIdrghsaxbeilkttsjvlqlpz">
         <w:r>
           <w:rPr>
             <w:rFonts w:ascii="DM Sans" w:cs="DM Sans" w:eastAsia="DM Sans" w:hAnsi="DM Sans"/>
@@ -1131,6 +1131,81 @@
           <w:sz w:val="21"/>
           <w:szCs w:val="21"/>
         </w:rPr>
+        <w:t xml:space="preserve">Operationalized privacy policy and frameworks across newsletter signup, consent, and opt-out</w:t>
+      </w:r>
+    </w:p>
+    <w:p>
+      <w:pPr>
+        <w:pStyle w:val="ListParagraph"/>
+        <w:keepNext/>
+        <w:numPr>
+          <w:ilvl w:val="0"/>
+          <w:numId w:val="1"/>
+        </w:numPr>
+        <w:spacing w:after="40" w:before="0"/>
+        <w:ind w:left="288"/>
+      </w:pPr>
+      <w:r>
+        <w:rPr>
+          <w:rFonts w:ascii="DM Sans" w:cs="DM Sans" w:eastAsia="DM Sans" w:hAnsi="DM Sans"/>
+          <w:b w:val="false"/>
+          <w:bCs w:val="false"/>
+          <w:i w:val="false"/>
+          <w:iCs w:val="false"/>
+          <w:color w:val="000000"/>
+          <w:sz w:val="21"/>
+          <w:szCs w:val="21"/>
+        </w:rPr>
+        <w:t xml:space="preserve">Architected consent data schema, flow, access, and deletion across the CDP and MarTech stack</w:t>
+      </w:r>
+    </w:p>
+    <w:p>
+      <w:pPr>
+        <w:pStyle w:val="ListParagraph"/>
+        <w:keepNext/>
+        <w:numPr>
+          <w:ilvl w:val="0"/>
+          <w:numId w:val="1"/>
+        </w:numPr>
+        <w:spacing w:after="40" w:before="0"/>
+        <w:ind w:left="288"/>
+      </w:pPr>
+      <w:r>
+        <w:rPr>
+          <w:rFonts w:ascii="DM Sans" w:cs="DM Sans" w:eastAsia="DM Sans" w:hAnsi="DM Sans"/>
+          <w:b w:val="false"/>
+          <w:bCs w:val="false"/>
+          <w:i w:val="false"/>
+          <w:iCs w:val="false"/>
+          <w:color w:val="000000"/>
+          <w:sz w:val="21"/>
+          <w:szCs w:val="21"/>
+        </w:rPr>
+        <w:t xml:space="preserve">Owned the newsletter preference center and its roadmap into user accounts and personalization</w:t>
+      </w:r>
+    </w:p>
+    <w:p>
+      <w:pPr>
+        <w:pStyle w:val="ListParagraph"/>
+        <w:keepNext/>
+        <w:numPr>
+          <w:ilvl w:val="0"/>
+          <w:numId w:val="1"/>
+        </w:numPr>
+        <w:spacing w:after="40" w:before="0"/>
+        <w:ind w:left="288"/>
+      </w:pPr>
+      <w:r>
+        <w:rPr>
+          <w:rFonts w:ascii="DM Sans" w:cs="DM Sans" w:eastAsia="DM Sans" w:hAnsi="DM Sans"/>
+          <w:b w:val="false"/>
+          <w:bCs w:val="false"/>
+          <w:i w:val="false"/>
+          <w:iCs w:val="false"/>
+          <w:color w:val="000000"/>
+          <w:sz w:val="21"/>
+          <w:szCs w:val="21"/>
+        </w:rPr>
         <w:t xml:space="preserve">Partnered with data science and operations to scale recipe recommendation service and </w:t>
       </w:r>
       <w:r>
@@ -1364,7 +1439,7 @@
         <w:keepNext/>
         <w:spacing w:after="0" w:before="200"/>
       </w:pPr>
-      <w:hyperlink w:history="1" r:id="rIdldhcnhkls6gvthkaa-w8i">
+      <w:hyperlink w:history="1" r:id="rIdgdetkiaks7dcn2jcarasn">
         <w:r>
           <w:rPr>
             <w:rFonts w:ascii="DM Sans" w:cs="DM Sans" w:eastAsia="DM Sans" w:hAnsi="DM Sans"/>
@@ -1687,6 +1762,56 @@
           <w:sz w:val="21"/>
           <w:szCs w:val="21"/>
         </w:rPr>
+        <w:t xml:space="preserve">Turned partner contract requirements into specs, and shaped contract terms with product proposals</w:t>
+      </w:r>
+    </w:p>
+    <w:p>
+      <w:pPr>
+        <w:pStyle w:val="ListParagraph"/>
+        <w:keepNext/>
+        <w:numPr>
+          <w:ilvl w:val="0"/>
+          <w:numId w:val="1"/>
+        </w:numPr>
+        <w:spacing w:after="40" w:before="0"/>
+        <w:ind w:left="288"/>
+      </w:pPr>
+      <w:r>
+        <w:rPr>
+          <w:rFonts w:ascii="DM Sans" w:cs="DM Sans" w:eastAsia="DM Sans" w:hAnsi="DM Sans"/>
+          <w:b w:val="false"/>
+          <w:bCs w:val="false"/>
+          <w:i w:val="false"/>
+          <w:iCs w:val="false"/>
+          <w:color w:val="000000"/>
+          <w:sz w:val="21"/>
+          <w:szCs w:val="21"/>
+        </w:rPr>
+        <w:t xml:space="preserve">Specced third-party content and data integrations over APIs, SFTP, and feeds</w:t>
+      </w:r>
+    </w:p>
+    <w:p>
+      <w:pPr>
+        <w:pStyle w:val="ListParagraph"/>
+        <w:keepNext/>
+        <w:numPr>
+          <w:ilvl w:val="0"/>
+          <w:numId w:val="1"/>
+        </w:numPr>
+        <w:spacing w:after="40" w:before="0"/>
+        <w:ind w:left="288"/>
+      </w:pPr>
+      <w:r>
+        <w:rPr>
+          <w:rFonts w:ascii="DM Sans" w:cs="DM Sans" w:eastAsia="DM Sans" w:hAnsi="DM Sans"/>
+          <w:b w:val="false"/>
+          <w:bCs w:val="false"/>
+          <w:i w:val="false"/>
+          <w:iCs w:val="false"/>
+          <w:color w:val="000000"/>
+          <w:sz w:val="21"/>
+          <w:szCs w:val="21"/>
+        </w:rPr>
         <w:t xml:space="preserve">Collaborated with partnerships, legal, and GTM to establish strategy for content and data solutions</w:t>
       </w:r>
     </w:p>
@@ -1894,7 +2019,7 @@
         <w:keepNext/>
         <w:spacing w:after="0" w:before="200"/>
       </w:pPr>
-      <w:hyperlink w:history="1" r:id="rId4skpjimhpg32wfz60qg4t">
+      <w:hyperlink w:history="1" r:id="rId0u2282n9wmnby4lbqq4cz">
         <w:r>
           <w:rPr>
             <w:rFonts w:ascii="DM Sans" w:cs="DM Sans" w:eastAsia="DM Sans" w:hAnsi="DM Sans"/>
@@ -2211,7 +2336,7 @@
         <w:keepNext/>
         <w:spacing w:after="0" w:before="200"/>
       </w:pPr>
-      <w:hyperlink w:history="1" r:id="rIdhjacixp_9hx4mfsa6_bo-">
+      <w:hyperlink w:history="1" r:id="rId-4yx6yiyxfdaoioogrjb9">
         <w:r>
           <w:rPr>
             <w:rFonts w:ascii="DM Sans" w:cs="DM Sans" w:eastAsia="DM Sans" w:hAnsi="DM Sans"/>
@@ -2478,7 +2603,7 @@
         <w:keepNext/>
         <w:spacing w:after="0" w:before="200"/>
       </w:pPr>
-      <w:hyperlink w:history="1" r:id="rIdyhjqkbdtcskjxwljzk7wo">
+      <w:hyperlink w:history="1" r:id="rIdcgutzukxj8itgc3crzlga">
         <w:r>
           <w:rPr>
             <w:rFonts w:ascii="DM Sans" w:cs="DM Sans" w:eastAsia="DM Sans" w:hAnsi="DM Sans"/>
@@ -2915,7 +3040,7 @@
         <w:keepNext/>
         <w:spacing w:after="0" w:before="0"/>
       </w:pPr>
-      <w:hyperlink w:history="1" r:id="rIdb_w-mavqszgu0yq7mwkly">
+      <w:hyperlink w:history="1" r:id="rIdoohqzf9xdq315uhfhrbm3">
         <w:r>
           <w:rPr>
             <w:rFonts w:ascii="DM Sans" w:cs="DM Sans" w:eastAsia="DM Sans" w:hAnsi="DM Sans"/>
@@ -3069,7 +3194,7 @@
         <w:keepNext/>
         <w:spacing w:after="0" w:before="200"/>
       </w:pPr>
-      <w:hyperlink w:history="1" r:id="rIdhlzo6zch_nhnepbz5a5qe">
+      <w:hyperlink w:history="1" r:id="rIdshkkmuucm4rsmnpi2beeq">
         <w:r>
           <w:rPr>
             <w:rFonts w:ascii="DM Sans" w:cs="DM Sans" w:eastAsia="DM Sans" w:hAnsi="DM Sans"/>
@@ -3198,7 +3323,7 @@
         <w:keepNext/>
         <w:spacing w:after="0" w:before="200"/>
       </w:pPr>
-      <w:hyperlink w:history="1" r:id="rIdjcl_a9klq-7eawz5bg5h2">
+      <w:hyperlink w:history="1" r:id="rIdu0dnm-r92isl-vgc-pdtf">
         <w:r>
           <w:rPr>
             <w:rFonts w:ascii="DM Sans" w:cs="DM Sans" w:eastAsia="DM Sans" w:hAnsi="DM Sans"/>
@@ -3419,7 +3544,7 @@
       </w:pBdr>
       <w:spacing w:after="80" w:before="40"/>
     </w:pPr>
-    <w:hyperlink w:history="1" r:id="rIdj96lm5__yv6n9xpidyuuu">
+    <w:hyperlink w:history="1" r:id="rIdr--xzun1r4yg0rypn60t0">
       <w:r>
         <w:rPr>
           <w:rFonts w:ascii="DM Sans" w:cs="DM Sans" w:eastAsia="DM Sans" w:hAnsi="DM Sans"/>
@@ -3444,7 +3569,7 @@
       </w:rPr>
       <w:t xml:space="preserve"> · </w:t>
     </w:r>
-    <w:hyperlink w:history="1" r:id="rId499ynes2mhvlf616nrrfd">
+    <w:hyperlink w:history="1" r:id="rIdehez7klocw-au_frly9sp">
       <w:r>
         <w:rPr>
           <w:rFonts w:ascii="DM Sans" w:cs="DM Sans" w:eastAsia="DM Sans" w:hAnsi="DM Sans"/>
@@ -3469,7 +3594,7 @@
       </w:rPr>
       <w:t xml:space="preserve"> · </w:t>
     </w:r>
-    <w:hyperlink w:history="1" r:id="rIdabcbrjrqoq2phoucybtyu">
+    <w:hyperlink w:history="1" r:id="rIdfmk7yvbuqos-vbvkwri9j">
       <w:r>
         <w:rPr>
           <w:rFonts w:ascii="DM Sans" w:cs="DM Sans" w:eastAsia="DM Sans" w:hAnsi="DM Sans"/>

</xml_diff>